<commit_message>
chore: update live demo endpoint across docs and generated assets
Co-Authored-By: Claude Code <noreply@anthropic.com>
</commit_message>
<xml_diff>
--- a/docs/Edumerge_Pre_Drive_Product_Engineering_Assignment_Mahesh_Mekala.docx
+++ b/docs/Edumerge_Pre_Drive_Product_Engineering_Assignment_Mahesh_Mekala.docx
@@ -245,7 +245,7 @@
                 <w:color w:val="2E75B6"/>
                 <w:sz w:val="19"/>
               </w:rPr>
-              <w:t xml:space="preserve"> https://roles-edit-pregnant-hamilton.trycloudflare.com</w:t>
+              <w:t xml:space="preserve"> https://responding-assumed-academics-marsh.trycloudflare.com</w:t>
             </w:r>
           </w:p>
         </w:tc>
@@ -2953,7 +2953,7 @@
               <w:br/>
               <w:t>Review Links:</w:t>
               <w:br/>
-              <w:t>• Live Deployed Prototype: https://roles-edit-pregnant-hamilton.trycloudflare.com</w:t>
+              <w:t>• Live Deployed Prototype: https://responding-assumed-academics-marsh.trycloudflare.com</w:t>
               <w:br/>
               <w:t>• GitHub Repository: https://github.com/Maheshmekala/edumerge-360</w:t>
               <w:br/>

</xml_diff>

<commit_message>
chore: update permanent 24/7 Render cloud deployment URL across all documents and generated assets
Co-Authored-By: Claude Code <noreply@anthropic.com>
</commit_message>
<xml_diff>
--- a/docs/Edumerge_Pre_Drive_Product_Engineering_Assignment_Mahesh_Mekala.docx
+++ b/docs/Edumerge_Pre_Drive_Product_Engineering_Assignment_Mahesh_Mekala.docx
@@ -245,7 +245,7 @@
                 <w:color w:val="2E75B6"/>
                 <w:sz w:val="19"/>
               </w:rPr>
-              <w:t xml:space="preserve"> https://responding-assumed-academics-marsh.trycloudflare.com</w:t>
+              <w:t xml:space="preserve"> https://edumerge-360.onrender.com</w:t>
             </w:r>
           </w:p>
         </w:tc>
@@ -2953,7 +2953,7 @@
               <w:br/>
               <w:t>Review Links:</w:t>
               <w:br/>
-              <w:t>• Live Deployed Prototype: https://responding-assumed-academics-marsh.trycloudflare.com</w:t>
+              <w:t>• Live Deployed Prototype: https://edumerge-360.onrender.com</w:t>
               <w:br/>
               <w:t>• GitHub Repository: https://github.com/Maheshmekala/edumerge-360</w:t>
               <w:br/>

</xml_diff>